<commit_message>
Widen Table 7's final column to a Y5 to Y10 replication range
Replaces the point Year 5 column with the supplied range: markets ~25 to 500,
Staffing ~$0.75M to $15.0M, institutional relationships ~3 to 10+,
institutional revenue ~$0.75M to $2.5M+, total ~$1.5M to $17.5M+.

Caption gains one clause tying the range's lower bound to the Year 5 base
case charted in Figure 12, so the table and the figure cannot be read as
disagreeing about Year 5. Column widths rebalanced for the longer entries.

Co-Authored-By: Claude Opus 5 <noreply@anthropic.com>
Claude-Session: https://claude.ai/code/session_01HAZLkLE85rjRAgcZW1sudJ
</commit_message>
<xml_diff>
--- a/docs/crp/passes/Olera_CRP_RevenueStream.docx
+++ b/docs/crp/passes/Olera_CRP_RevenueStream.docx
@@ -1349,17 +1349,17 @@
         <w:tblLayout w:type="fixed"/>
       </w:tblPr>
       <w:tblGrid>
-        <w:gridCol w:w="3024"/>
-        <w:gridCol w:w="1555"/>
-        <w:gridCol w:w="1555"/>
-        <w:gridCol w:w="1555"/>
-        <w:gridCol w:w="1555"/>
-        <w:gridCol w:w="1555"/>
+        <w:gridCol w:w="2808"/>
+        <w:gridCol w:w="1188"/>
+        <w:gridCol w:w="1296"/>
+        <w:gridCol w:w="1296"/>
+        <w:gridCol w:w="1404"/>
+        <w:gridCol w:w="2808"/>
       </w:tblGrid>
       <w:tr>
         <w:tc>
           <w:tcPr>
-            <w:tcW w:type="dxa" w:w="3024"/>
+            <w:tcW w:type="dxa" w:w="2808"/>
             <w:tcBorders>
               <w:bottom w:val="single" w:sz="8" w:space="0" w:color="14453F"/>
             </w:tcBorders>
@@ -1375,7 +1375,7 @@
         </w:tc>
         <w:tc>
           <w:tcPr>
-            <w:tcW w:type="dxa" w:w="1555"/>
+            <w:tcW w:type="dxa" w:w="1188"/>
             <w:tcBorders>
               <w:bottom w:val="single" w:sz="8" w:space="0" w:color="14453F"/>
             </w:tcBorders>
@@ -1400,7 +1400,7 @@
         </w:tc>
         <w:tc>
           <w:tcPr>
-            <w:tcW w:type="dxa" w:w="1555"/>
+            <w:tcW w:type="dxa" w:w="1296"/>
             <w:tcBorders>
               <w:bottom w:val="single" w:sz="8" w:space="0" w:color="14453F"/>
             </w:tcBorders>
@@ -1425,7 +1425,7 @@
         </w:tc>
         <w:tc>
           <w:tcPr>
-            <w:tcW w:type="dxa" w:w="1555"/>
+            <w:tcW w:type="dxa" w:w="1296"/>
             <w:tcBorders>
               <w:bottom w:val="single" w:sz="8" w:space="0" w:color="14453F"/>
             </w:tcBorders>
@@ -1450,7 +1450,7 @@
         </w:tc>
         <w:tc>
           <w:tcPr>
-            <w:tcW w:type="dxa" w:w="1555"/>
+            <w:tcW w:type="dxa" w:w="1404"/>
             <w:tcBorders>
               <w:bottom w:val="single" w:sz="8" w:space="0" w:color="14453F"/>
             </w:tcBorders>
@@ -1475,7 +1475,7 @@
         </w:tc>
         <w:tc>
           <w:tcPr>
-            <w:tcW w:type="dxa" w:w="1555"/>
+            <w:tcW w:type="dxa" w:w="2808"/>
             <w:tcBorders>
               <w:bottom w:val="single" w:sz="8" w:space="0" w:color="14453F"/>
             </w:tcBorders>
@@ -1494,7 +1494,7 @@
                 <w:color w:val="14453F"/>
                 <w:sz w:val="18"/>
               </w:rPr>
-              <w:t>Post-CRP Y5</w:t>
+              <w:t>Post-CRP Y5–Y10 potential</w:t>
             </w:r>
           </w:p>
         </w:tc>
@@ -1502,7 +1502,7 @@
       <w:tr>
         <w:tc>
           <w:tcPr>
-            <w:tcW w:type="dxa" w:w="3024"/>
+            <w:tcW w:type="dxa" w:w="2808"/>
             <w:tcBorders>
               <w:bottom w:val="single" w:sz="2" w:space="0" w:color="B9C4BD"/>
             </w:tcBorders>
@@ -1527,7 +1527,7 @@
         </w:tc>
         <w:tc>
           <w:tcPr>
-            <w:tcW w:type="dxa" w:w="1555"/>
+            <w:tcW w:type="dxa" w:w="1188"/>
             <w:tcBorders>
               <w:bottom w:val="single" w:sz="2" w:space="0" w:color="B9C4BD"/>
             </w:tcBorders>
@@ -1551,7 +1551,7 @@
         </w:tc>
         <w:tc>
           <w:tcPr>
-            <w:tcW w:type="dxa" w:w="1555"/>
+            <w:tcW w:type="dxa" w:w="1296"/>
             <w:tcBorders>
               <w:bottom w:val="single" w:sz="2" w:space="0" w:color="B9C4BD"/>
             </w:tcBorders>
@@ -1575,7 +1575,7 @@
         </w:tc>
         <w:tc>
           <w:tcPr>
-            <w:tcW w:type="dxa" w:w="1555"/>
+            <w:tcW w:type="dxa" w:w="1296"/>
             <w:tcBorders>
               <w:bottom w:val="single" w:sz="2" w:space="0" w:color="B9C4BD"/>
             </w:tcBorders>
@@ -1599,7 +1599,7 @@
         </w:tc>
         <w:tc>
           <w:tcPr>
-            <w:tcW w:type="dxa" w:w="1555"/>
+            <w:tcW w:type="dxa" w:w="1404"/>
             <w:tcBorders>
               <w:bottom w:val="single" w:sz="2" w:space="0" w:color="B9C4BD"/>
             </w:tcBorders>
@@ -1623,7 +1623,7 @@
         </w:tc>
         <w:tc>
           <w:tcPr>
-            <w:tcW w:type="dxa" w:w="1555"/>
+            <w:tcW w:type="dxa" w:w="2808"/>
             <w:tcBorders>
               <w:bottom w:val="single" w:sz="2" w:space="0" w:color="B9C4BD"/>
             </w:tcBorders>
@@ -1641,7 +1641,7 @@
                 <w:i w:val="0"/>
                 <w:sz w:val="18"/>
               </w:rPr>
-              <w:t>Scale</w:t>
+              <w:t>Scale to national replication</w:t>
             </w:r>
           </w:p>
         </w:tc>
@@ -1649,7 +1649,7 @@
       <w:tr>
         <w:tc>
           <w:tcPr>
-            <w:tcW w:type="dxa" w:w="3024"/>
+            <w:tcW w:type="dxa" w:w="2808"/>
             <w:tcBorders>
               <w:bottom w:val="single" w:sz="2" w:space="0" w:color="B9C4BD"/>
             </w:tcBorders>
@@ -1674,7 +1674,7 @@
         </w:tc>
         <w:tc>
           <w:tcPr>
-            <w:tcW w:type="dxa" w:w="1555"/>
+            <w:tcW w:type="dxa" w:w="1188"/>
             <w:tcBorders>
               <w:bottom w:val="single" w:sz="2" w:space="0" w:color="B9C4BD"/>
             </w:tcBorders>
@@ -1698,7 +1698,7 @@
         </w:tc>
         <w:tc>
           <w:tcPr>
-            <w:tcW w:type="dxa" w:w="1555"/>
+            <w:tcW w:type="dxa" w:w="1296"/>
             <w:tcBorders>
               <w:bottom w:val="single" w:sz="2" w:space="0" w:color="B9C4BD"/>
             </w:tcBorders>
@@ -1722,7 +1722,7 @@
         </w:tc>
         <w:tc>
           <w:tcPr>
-            <w:tcW w:type="dxa" w:w="1555"/>
+            <w:tcW w:type="dxa" w:w="1296"/>
             <w:tcBorders>
               <w:bottom w:val="single" w:sz="2" w:space="0" w:color="B9C4BD"/>
             </w:tcBorders>
@@ -1746,7 +1746,7 @@
         </w:tc>
         <w:tc>
           <w:tcPr>
-            <w:tcW w:type="dxa" w:w="1555"/>
+            <w:tcW w:type="dxa" w:w="1404"/>
             <w:tcBorders>
               <w:bottom w:val="single" w:sz="2" w:space="0" w:color="B9C4BD"/>
             </w:tcBorders>
@@ -1770,7 +1770,7 @@
         </w:tc>
         <w:tc>
           <w:tcPr>
-            <w:tcW w:type="dxa" w:w="1555"/>
+            <w:tcW w:type="dxa" w:w="2808"/>
             <w:tcBorders>
               <w:bottom w:val="single" w:sz="2" w:space="0" w:color="B9C4BD"/>
             </w:tcBorders>
@@ -1788,7 +1788,7 @@
                 <w:i w:val="0"/>
                 <w:sz w:val="18"/>
               </w:rPr>
-              <w:t>~25</w:t>
+              <w:t>~25 to 500 counties</w:t>
             </w:r>
           </w:p>
         </w:tc>
@@ -1796,7 +1796,7 @@
       <w:tr>
         <w:tc>
           <w:tcPr>
-            <w:tcW w:type="dxa" w:w="3024"/>
+            <w:tcW w:type="dxa" w:w="2808"/>
             <w:tcBorders>
               <w:bottom w:val="single" w:sz="2" w:space="0" w:color="B9C4BD"/>
             </w:tcBorders>
@@ -1821,7 +1821,7 @@
         </w:tc>
         <w:tc>
           <w:tcPr>
-            <w:tcW w:type="dxa" w:w="1555"/>
+            <w:tcW w:type="dxa" w:w="1188"/>
             <w:tcBorders>
               <w:bottom w:val="single" w:sz="2" w:space="0" w:color="B9C4BD"/>
             </w:tcBorders>
@@ -1845,7 +1845,7 @@
         </w:tc>
         <w:tc>
           <w:tcPr>
-            <w:tcW w:type="dxa" w:w="1555"/>
+            <w:tcW w:type="dxa" w:w="1296"/>
             <w:tcBorders>
               <w:bottom w:val="single" w:sz="2" w:space="0" w:color="B9C4BD"/>
             </w:tcBorders>
@@ -1869,7 +1869,7 @@
         </w:tc>
         <w:tc>
           <w:tcPr>
-            <w:tcW w:type="dxa" w:w="1555"/>
+            <w:tcW w:type="dxa" w:w="1296"/>
             <w:tcBorders>
               <w:bottom w:val="single" w:sz="2" w:space="0" w:color="B9C4BD"/>
             </w:tcBorders>
@@ -1893,7 +1893,7 @@
         </w:tc>
         <w:tc>
           <w:tcPr>
-            <w:tcW w:type="dxa" w:w="1555"/>
+            <w:tcW w:type="dxa" w:w="1404"/>
             <w:tcBorders>
               <w:bottom w:val="single" w:sz="2" w:space="0" w:color="B9C4BD"/>
             </w:tcBorders>
@@ -1917,7 +1917,7 @@
         </w:tc>
         <w:tc>
           <w:tcPr>
-            <w:tcW w:type="dxa" w:w="1555"/>
+            <w:tcW w:type="dxa" w:w="2808"/>
             <w:tcBorders>
               <w:bottom w:val="single" w:sz="2" w:space="0" w:color="B9C4BD"/>
             </w:tcBorders>
@@ -1935,7 +1935,7 @@
                 <w:i w:val="0"/>
                 <w:sz w:val="18"/>
               </w:rPr>
-              <w:t>~$750K</w:t>
+              <w:t>~$0.75M–$15.0M/yr</w:t>
             </w:r>
           </w:p>
         </w:tc>
@@ -1943,7 +1943,7 @@
       <w:tr>
         <w:tc>
           <w:tcPr>
-            <w:tcW w:type="dxa" w:w="3024"/>
+            <w:tcW w:type="dxa" w:w="2808"/>
             <w:tcBorders>
               <w:bottom w:val="single" w:sz="2" w:space="0" w:color="B9C4BD"/>
             </w:tcBorders>
@@ -1968,7 +1968,7 @@
         </w:tc>
         <w:tc>
           <w:tcPr>
-            <w:tcW w:type="dxa" w:w="1555"/>
+            <w:tcW w:type="dxa" w:w="1188"/>
             <w:tcBorders>
               <w:bottom w:val="single" w:sz="2" w:space="0" w:color="B9C4BD"/>
             </w:tcBorders>
@@ -1992,7 +1992,7 @@
         </w:tc>
         <w:tc>
           <w:tcPr>
-            <w:tcW w:type="dxa" w:w="1555"/>
+            <w:tcW w:type="dxa" w:w="1296"/>
             <w:tcBorders>
               <w:bottom w:val="single" w:sz="2" w:space="0" w:color="B9C4BD"/>
             </w:tcBorders>
@@ -2016,7 +2016,7 @@
         </w:tc>
         <w:tc>
           <w:tcPr>
-            <w:tcW w:type="dxa" w:w="1555"/>
+            <w:tcW w:type="dxa" w:w="1296"/>
             <w:tcBorders>
               <w:bottom w:val="single" w:sz="2" w:space="0" w:color="B9C4BD"/>
             </w:tcBorders>
@@ -2040,7 +2040,7 @@
         </w:tc>
         <w:tc>
           <w:tcPr>
-            <w:tcW w:type="dxa" w:w="1555"/>
+            <w:tcW w:type="dxa" w:w="1404"/>
             <w:tcBorders>
               <w:bottom w:val="single" w:sz="2" w:space="0" w:color="B9C4BD"/>
             </w:tcBorders>
@@ -2064,7 +2064,7 @@
         </w:tc>
         <w:tc>
           <w:tcPr>
-            <w:tcW w:type="dxa" w:w="1555"/>
+            <w:tcW w:type="dxa" w:w="2808"/>
             <w:tcBorders>
               <w:bottom w:val="single" w:sz="2" w:space="0" w:color="B9C4BD"/>
             </w:tcBorders>
@@ -2082,7 +2082,7 @@
                 <w:i w:val="0"/>
                 <w:sz w:val="18"/>
               </w:rPr>
-              <w:t>~3</w:t>
+              <w:t>~3 to 10+</w:t>
             </w:r>
           </w:p>
         </w:tc>
@@ -2090,7 +2090,7 @@
       <w:tr>
         <w:tc>
           <w:tcPr>
-            <w:tcW w:type="dxa" w:w="3024"/>
+            <w:tcW w:type="dxa" w:w="2808"/>
             <w:tcBorders>
               <w:bottom w:val="single" w:sz="2" w:space="0" w:color="B9C4BD"/>
             </w:tcBorders>
@@ -2115,7 +2115,7 @@
         </w:tc>
         <w:tc>
           <w:tcPr>
-            <w:tcW w:type="dxa" w:w="1555"/>
+            <w:tcW w:type="dxa" w:w="1188"/>
             <w:tcBorders>
               <w:bottom w:val="single" w:sz="2" w:space="0" w:color="B9C4BD"/>
             </w:tcBorders>
@@ -2139,7 +2139,7 @@
         </w:tc>
         <w:tc>
           <w:tcPr>
-            <w:tcW w:type="dxa" w:w="1555"/>
+            <w:tcW w:type="dxa" w:w="1296"/>
             <w:tcBorders>
               <w:bottom w:val="single" w:sz="2" w:space="0" w:color="B9C4BD"/>
             </w:tcBorders>
@@ -2163,7 +2163,7 @@
         </w:tc>
         <w:tc>
           <w:tcPr>
-            <w:tcW w:type="dxa" w:w="1555"/>
+            <w:tcW w:type="dxa" w:w="1296"/>
             <w:tcBorders>
               <w:bottom w:val="single" w:sz="2" w:space="0" w:color="B9C4BD"/>
             </w:tcBorders>
@@ -2187,7 +2187,7 @@
         </w:tc>
         <w:tc>
           <w:tcPr>
-            <w:tcW w:type="dxa" w:w="1555"/>
+            <w:tcW w:type="dxa" w:w="1404"/>
             <w:tcBorders>
               <w:bottom w:val="single" w:sz="2" w:space="0" w:color="B9C4BD"/>
             </w:tcBorders>
@@ -2211,7 +2211,7 @@
         </w:tc>
         <w:tc>
           <w:tcPr>
-            <w:tcW w:type="dxa" w:w="1555"/>
+            <w:tcW w:type="dxa" w:w="2808"/>
             <w:tcBorders>
               <w:bottom w:val="single" w:sz="2" w:space="0" w:color="B9C4BD"/>
             </w:tcBorders>
@@ -2229,7 +2229,7 @@
                 <w:i w:val="0"/>
                 <w:sz w:val="18"/>
               </w:rPr>
-              <w:t>~$750K</w:t>
+              <w:t>~$0.75M–$2.5M+/yr</w:t>
             </w:r>
           </w:p>
         </w:tc>
@@ -2237,7 +2237,7 @@
       <w:tr>
         <w:tc>
           <w:tcPr>
-            <w:tcW w:type="dxa" w:w="3024"/>
+            <w:tcW w:type="dxa" w:w="2808"/>
             <w:shd w:val="clear" w:fill="EEF3F0"/>
             <w:tcBorders>
               <w:bottom w:val="single" w:sz="8" w:space="0" w:color="14453F"/>
@@ -2262,7 +2262,7 @@
         </w:tc>
         <w:tc>
           <w:tcPr>
-            <w:tcW w:type="dxa" w:w="1555"/>
+            <w:tcW w:type="dxa" w:w="1188"/>
             <w:shd w:val="clear" w:fill="EEF3F0"/>
             <w:tcBorders>
               <w:bottom w:val="single" w:sz="8" w:space="0" w:color="14453F"/>
@@ -2286,7 +2286,7 @@
         </w:tc>
         <w:tc>
           <w:tcPr>
-            <w:tcW w:type="dxa" w:w="1555"/>
+            <w:tcW w:type="dxa" w:w="1296"/>
             <w:shd w:val="clear" w:fill="EEF3F0"/>
             <w:tcBorders>
               <w:bottom w:val="single" w:sz="8" w:space="0" w:color="14453F"/>
@@ -2310,7 +2310,7 @@
         </w:tc>
         <w:tc>
           <w:tcPr>
-            <w:tcW w:type="dxa" w:w="1555"/>
+            <w:tcW w:type="dxa" w:w="1296"/>
             <w:shd w:val="clear" w:fill="EEF3F0"/>
             <w:tcBorders>
               <w:bottom w:val="single" w:sz="8" w:space="0" w:color="14453F"/>
@@ -2334,7 +2334,7 @@
         </w:tc>
         <w:tc>
           <w:tcPr>
-            <w:tcW w:type="dxa" w:w="1555"/>
+            <w:tcW w:type="dxa" w:w="1404"/>
             <w:shd w:val="clear" w:fill="EEF3F0"/>
             <w:tcBorders>
               <w:bottom w:val="single" w:sz="8" w:space="0" w:color="14453F"/>
@@ -2358,7 +2358,7 @@
         </w:tc>
         <w:tc>
           <w:tcPr>
-            <w:tcW w:type="dxa" w:w="1555"/>
+            <w:tcW w:type="dxa" w:w="2808"/>
             <w:shd w:val="clear" w:fill="EEF3F0"/>
             <w:tcBorders>
               <w:bottom w:val="single" w:sz="8" w:space="0" w:color="14453F"/>
@@ -2376,7 +2376,7 @@
                 <w:i w:val="0"/>
                 <w:sz w:val="18"/>
               </w:rPr>
-              <w:t>~$1.50M</w:t>
+              <w:t>~$1.5M–$17.5M+/yr</w:t>
             </w:r>
           </w:p>
         </w:tc>
@@ -2401,7 +2401,7 @@
           <w:i w:val="0"/>
           <w:sz w:val="18"/>
         </w:rPr>
-        <w:t xml:space="preserve"> Illustrative base case. *Year 3 assumes approximately six paid-month equivalents across the eight CRP markets; the resulting exit Staffing run rate is approximately $240K a year at the same conservative throughput.</w:t>
+        <w:t xml:space="preserve"> Illustrative base case through post-CRP Year 4. The final column widens Year 5 into a Year 5 to Year 10 replication range whose lower bound is the Year 5 base case charted in Figure 12. *Year 3 assumes approximately six paid-month equivalents across the eight CRP markets; the resulting exit Staffing run rate is approximately $240K a year at the same conservative throughput.</w:t>
       </w:r>
     </w:p>
     <w:p>

</xml_diff>